<commit_message>
Document backup & versioning; refresh summary docs
</commit_message>
<xml_diff>
--- a/docs/Project_Summary.docx
+++ b/docs/Project_Summary.docx
@@ -416,6 +416,10 @@
         <w:br/>
         <w:t>docs/      Demo screenshot and this summary</w:t>
         <w:br/>
+        <w:t>scripts/   Word-doc generators and helpers</w:t>
+        <w:br/>
+        <w:t>backup.ps1 Local backup script (git bundle + source zip)</w:t>
+        <w:br/>
         <w:t>.github/   CI (tests) and deploy workflows</w:t>
       </w:r>
     </w:p>
@@ -483,6 +487,30 @@
       </w:pPr>
       <w:r>
         <w:t>The upload endpoint validates file extensions against an allow-list and sanitizes filenames to prevent path-traversal writes outside data/.</w:t>
+      </w:r>
+    </w:p>
+    <w:p>
+      <w:pPr>
+        <w:pStyle w:val="Heading1"/>
+      </w:pPr>
+      <w:r>
+        <w:t>Backup &amp; versioning</w:t>
+      </w:r>
+    </w:p>
+    <w:p>
+      <w:pPr>
+        <w:pStyle w:val="ListBullet"/>
+      </w:pPr>
+      <w:r>
+        <w:t>Version-controlled with Git and published on GitHub, with tagged releases (e.g. v1.0.0) marking stable, restorable checkpoints.</w:t>
+      </w:r>
+    </w:p>
+    <w:p>
+      <w:pPr>
+        <w:pStyle w:val="ListBullet"/>
+      </w:pPr>
+      <w:r>
+        <w:t>backup.ps1 creates two local backups in a sibling folder: a git bundle with the complete commit history (clone it offline with git clone &lt;file&gt;.bundle) and a source zip snapshot of tracked files.</w:t>
       </w:r>
     </w:p>
     <w:p>

</xml_diff>

<commit_message>
Add drag-and-drop upload and indexed-document list
</commit_message>
<xml_diff>
--- a/docs/Project_Summary.docx
+++ b/docs/Project_Summary.docx
@@ -108,7 +108,7 @@
         <w:pStyle w:val="ListBullet"/>
       </w:pPr>
       <w:r>
-        <w:t>In-browser upload — add a document with the + Add document button and it is indexed immediately.</w:t>
+        <w:t>In-browser upload — add a document with the + Add document button or by dragging and dropping it onto the page; it is indexed immediately and the indexed-document list refreshes.</w:t>
       </w:r>
     </w:p>
     <w:p>
@@ -462,7 +462,7 @@
     </w:p>
     <w:p>
       <w:r>
-        <w:t>The suite (24 tests) covers text chunking, the on-disk vector store, multi-format document reading, provider selection, and the API endpoints (chat, streaming, upload, validation, and a path-traversal security check). It runs fully offline because the language model is mocked.</w:t>
+        <w:t>The suite (25 tests) covers text chunking, the on-disk vector store, multi-format document reading, provider selection, and the API endpoints (chat, streaming, upload, validation, and a path-traversal security check). It runs fully offline because the language model is mocked.</w:t>
       </w:r>
     </w:p>
     <w:p>
@@ -535,14 +535,6 @@
       </w:pPr>
       <w:r>
         <w:t>Heading- or paragraph-aware chunking for more precise retrieval.</w:t>
-      </w:r>
-    </w:p>
-    <w:p>
-      <w:pPr>
-        <w:pStyle w:val="ListBullet"/>
-      </w:pPr>
-      <w:r>
-        <w:t>Drag-and-drop upload and a document management view.</w:t>
       </w:r>
     </w:p>
     <w:p>

</xml_diff>

<commit_message>
Add RAG pipeline tests, coverage reporting, and coverage badge (79%)
</commit_message>
<xml_diff>
--- a/docs/Project_Summary.docx
+++ b/docs/Project_Summary.docx
@@ -384,7 +384,7 @@
           </w:tcPr>
           <w:p>
             <w:r>
-              <w:t>pytest, FastAPI TestClient, GitHub Actions</w:t>
+              <w:t>pytest, pytest-cov, FastAPI TestClient, GitHub Actions</w:t>
             </w:r>
           </w:p>
         </w:tc>
@@ -462,7 +462,7 @@
     </w:p>
     <w:p>
       <w:r>
-        <w:t>The suite (25 tests) covers text chunking, the on-disk vector store, multi-format document reading, provider selection, and the API endpoints (chat, streaming, upload, validation, and a path-traversal security check). It runs fully offline because the language model is mocked.</w:t>
+        <w:t>The suite (35 tests) covers text chunking, the on-disk vector store, multi-format document reading, provider selection, the RAG pipeline internals (retrieval, prompt building, answer and streaming generation, and the unconfigured-model paths), and the API endpoints (chat, streaming, upload, validation, document list, and a path-traversal security check). It runs fully offline because the language model is mocked, and reports about 79% line coverage of the backend.</w:t>
       </w:r>
     </w:p>
     <w:p>

</xml_diff>

<commit_message>
Add agentic RAG layer (routing, retrieval self-evaluation, clarification)
New backend/agent.py orchestrates an agent loop: routes each question (answer/search/clarify), grades whether retrieved context is sufficient, and rephrases + retries the search up to a limit before answering. Exposed via POST /api/agent and an Agent mode toggle in the UI that shows the reasoning steps. Adds 13 tests (48 total, ~81% backend coverage) and updates all docs.
</commit_message>
<xml_diff>
--- a/docs/Project_Summary.docx
+++ b/docs/Project_Summary.docx
@@ -116,6 +116,14 @@
         <w:pStyle w:val="ListBullet"/>
       </w:pPr>
       <w:r>
+        <w:t>Agentic mode — an optional agent loop that routes each question (answer directly, search, or ask for clarification), self-evaluates the retrieved context with the model, and rephrases and retries the search when the context is insufficient; the reasoning steps are returned and shown in the UI.</w:t>
+      </w:r>
+    </w:p>
+    <w:p>
+      <w:pPr>
+        <w:pStyle w:val="ListBullet"/>
+      </w:pPr>
+      <w:r>
         <w:t>Local-first and free — Ollama with llama3.2:1b (chat) and nomic-embed-text (embeddings); a NumPy cosine-similarity store replaces a cloud vector database.</w:t>
       </w:r>
     </w:p>
@@ -151,11 +159,13 @@
         </w:rPr>
         <w:t>Browser (HTML/CSS/JS)</w:t>
         <w:br/>
-        <w:t xml:space="preserve">    | POST /api/chat/stream (SSE), POST /api/upload</w:t>
+        <w:t xml:space="preserve">    | POST /api/chat/stream (SSE), POST /api/agent, POST /api/upload</w:t>
         <w:br/>
         <w:t xml:space="preserve">    v</w:t>
         <w:br/>
         <w:t>FastAPI app (backend/app.py)</w:t>
+        <w:br/>
+        <w:t xml:space="preserve">    - Agent loop (backend/agent.py): route -&gt; retrieve -&gt; self-check -&gt; rephrase + retry -&gt; answer</w:t>
         <w:br/>
         <w:t xml:space="preserve">    v</w:t>
         <w:br/>
@@ -404,7 +414,7 @@
           <w:rFonts w:ascii="Consolas" w:hAnsi="Consolas"/>
           <w:sz w:val="18"/>
         </w:rPr>
-        <w:t>backend/   FastAPI app, RAG pipeline, ingestion, vector store, config</w:t>
+        <w:t>backend/   FastAPI app, RAG pipeline, agent loop, ingestion, store, config</w:t>
         <w:br/>
         <w:t>frontend/  Static chat UI (HTML/CSS/JS)</w:t>
         <w:br/>
@@ -462,7 +472,7 @@
     </w:p>
     <w:p>
       <w:r>
-        <w:t>The suite (35 tests) covers text chunking, the on-disk vector store, multi-format document reading, provider selection, the RAG pipeline internals (retrieval, prompt building, answer and streaming generation, and the unconfigured-model paths), and the API endpoints (chat, streaming, upload, validation, document list, and a path-traversal security check). It runs fully offline because the language model is mocked, and reports about 79% line coverage of the backend.</w:t>
+        <w:t>The suite (48 tests) covers text chunking, the on-disk vector store, multi-format document reading, provider selection, the RAG pipeline internals (retrieval, prompt building, answer and streaming generation, and the unconfigured-model paths), the agent loop (routing, retrieval self-evaluation, rephrase-and-retry, and clarification paths), and the API endpoints (chat, streaming, agent, upload, validation, document list, and a path-traversal security check). It runs fully offline because the language model is mocked, and reports about 81% line coverage of the backend.</w:t>
       </w:r>
     </w:p>
     <w:p>
@@ -526,7 +536,7 @@
         <w:pStyle w:val="ListBullet"/>
       </w:pPr>
       <w:r>
-        <w:t>Conversation memory for follow-up questions.</w:t>
+        <w:t>Conversation memory for multi-turn agent follow-ups.</w:t>
       </w:r>
     </w:p>
     <w:p>

</xml_diff>